<commit_message>
refactor: move report pipeline to kpi-lab-report skill
Скрипти збірки звіту переїхали в ~/.claude/skills/kpi-lab-report/,
щоб їх можна було використати для лаб з інших предметів. Тут
лишились рецепти just, що кличуть скіл.

Титулка тепер будується з frontmatter на початку report.md замість
руками написаного markdown з розпірками. Зібраний .docx структурно
збігається з попереднім до одиниці: 17 рисунків, 18 підписів,
9 таблиць, 266 формул, 375 абзаців.

Co-Authored-By: Claude Opus 5 (1M context) <noreply@anthropic.com>
</commit_message>
<xml_diff>
--- a/lab-1/docs/report/reference.docx
+++ b/lab-1/docs/report/reference.docx
@@ -1137,7 +1137,7 @@
     <w:name w:val="Verbatim Char"/>
     <w:basedOn w:val="BodyTextChar"/>
     <w:rPr>
-      <w:rFonts w:ascii="Courier New" w:hAnsi="Courier New" w:cs="Courier New"/>
+      <w:rFonts w:ascii="Courier New" w:hAnsi="Courier New" w:cs="Courier New" w:eastAsia="Courier New"/>
       <w:sz w:val="20"/>
       <w:szCs w:val="20"/>
     </w:rPr>
@@ -1178,6 +1178,21 @@
       <w:color w:val="365F91" w:themeColor="accent1" w:themeShade="BF"/>
     </w:rPr>
   </w:style>
+  <w:style w:type="paragraph" w:styleId="SourceCode">
+    <w:name w:val="Source Code"/>
+    <w:basedOn w:val="Normal"/>
+    <w:qFormat/>
+    <w:pPr>
+      <w:spacing w:before="0" w:after="0" w:line="240" w:lineRule="auto"/>
+      <w:ind w:firstLine="0" w:left="0"/>
+      <w:jc w:val="left"/>
+    </w:pPr>
+    <w:rPr>
+      <w:rFonts w:ascii="Courier New" w:hAnsi="Courier New" w:cs="Courier New" w:eastAsia="Courier New"/>
+      <w:sz w:val="20"/>
+      <w:szCs w:val="20"/>
+    </w:rPr>
+  </w:style>
   <w:style w:type="paragraph" w:styleId="TitlePage">
     <w:name w:val="Титульний"/>
     <w:basedOn w:val="Normal"/>
@@ -1187,33 +1202,6 @@
       <w:ind w:firstLine="0" w:left="0"/>
       <w:jc w:val="center"/>
     </w:pPr>
-  </w:style>
-  <w:style w:type="paragraph" w:styleId="TableCaptionOwn">
-    <w:name w:val="Підпис таблиці"/>
-    <w:basedOn w:val="Normal"/>
-    <w:qFormat/>
-    <w:pPr>
-      <w:keepNext/>
-      <w:keepLines/>
-      <w:spacing w:before="240" w:after="60" w:line="240" w:lineRule="auto"/>
-      <w:ind w:firstLine="0" w:left="0"/>
-      <w:jc w:val="left"/>
-    </w:pPr>
-  </w:style>
-  <w:style w:type="paragraph" w:styleId="SourceCode">
-    <w:name w:val="Source Code"/>
-    <w:basedOn w:val="Normal"/>
-    <w:qFormat/>
-    <w:pPr>
-      <w:spacing w:before="0" w:after="0" w:line="240" w:lineRule="auto"/>
-      <w:ind w:firstLine="0" w:left="0"/>
-      <w:jc w:val="left"/>
-    </w:pPr>
-    <w:rPr>
-      <w:rFonts w:ascii="Courier New" w:hAnsi="Courier New" w:cs="Courier New"/>
-      <w:sz w:val="20"/>
-      <w:szCs w:val="20"/>
-    </w:rPr>
   </w:style>
   <w:style w:type="paragraph" w:styleId="TitlePageLeft">
     <w:name w:val="Титульний лівий"/>
@@ -1245,6 +1233,18 @@
       <w:spacing w:before="0" w:after="240" w:line="240" w:lineRule="auto"/>
       <w:ind w:firstLine="0" w:left="0"/>
       <w:jc w:val="center"/>
+    </w:pPr>
+  </w:style>
+  <w:style w:type="paragraph" w:styleId="TableCaptionOwn">
+    <w:name w:val="Підпис таблиці"/>
+    <w:basedOn w:val="Normal"/>
+    <w:qFormat/>
+    <w:pPr>
+      <w:keepNext/>
+      <w:keepLines/>
+      <w:spacing w:before="240" w:after="60" w:line="240" w:lineRule="auto"/>
+      <w:ind w:firstLine="0" w:left="0"/>
+      <w:jc w:val="left"/>
     </w:pPr>
   </w:style>
 </w:styles>

</xml_diff>